<commit_message>
Springboot JAP terms added
</commit_message>
<xml_diff>
--- a/Java/SpringBoot_terms.docx
+++ b/Java/SpringBoot_terms.docx
@@ -6753,7 +6753,7 @@
       </w:pPr>
       <w:r>
         <w:pict w14:anchorId="7118FBE1">
-          <v:rect id="_x0000_i1262" style="width:0;height:1.5pt" o:hralign="center" o:hrstd="t" o:hr="t" fillcolor="#a0a0a0" stroked="f"/>
+          <v:rect id="_x0000_i1028" style="width:0;height:1.5pt" o:hralign="center" o:hrstd="t" o:hr="t" fillcolor="#a0a0a0" stroked="f"/>
         </w:pict>
       </w:r>
     </w:p>
@@ -6985,7 +6985,7 @@
       </w:pPr>
       <w:r>
         <w:pict w14:anchorId="6683D974">
-          <v:rect id="_x0000_i1263" style="width:0;height:1.5pt" o:hralign="center" o:hrstd="t" o:hr="t" fillcolor="#a0a0a0" stroked="f"/>
+          <v:rect id="_x0000_i1029" style="width:0;height:1.5pt" o:hralign="center" o:hrstd="t" o:hr="t" fillcolor="#a0a0a0" stroked="f"/>
         </w:pict>
       </w:r>
     </w:p>
@@ -7075,7 +7075,7 @@
       </w:pPr>
       <w:r>
         <w:pict w14:anchorId="6B3A1493">
-          <v:rect id="_x0000_i1264" style="width:0;height:1.5pt" o:hralign="center" o:hrstd="t" o:hr="t" fillcolor="#a0a0a0" stroked="f"/>
+          <v:rect id="_x0000_i1030" style="width:0;height:1.5pt" o:hralign="center" o:hrstd="t" o:hr="t" fillcolor="#a0a0a0" stroked="f"/>
         </w:pict>
       </w:r>
     </w:p>
@@ -7170,7 +7170,7 @@
       </w:pPr>
       <w:r>
         <w:pict w14:anchorId="2E3438A6">
-          <v:rect id="_x0000_i1265" style="width:0;height:1.5pt" o:hralign="center" o:hrstd="t" o:hr="t" fillcolor="#a0a0a0" stroked="f"/>
+          <v:rect id="_x0000_i1031" style="width:0;height:1.5pt" o:hralign="center" o:hrstd="t" o:hr="t" fillcolor="#a0a0a0" stroked="f"/>
         </w:pict>
       </w:r>
     </w:p>
@@ -7264,7 +7264,7 @@
       </w:pPr>
       <w:r>
         <w:pict w14:anchorId="246E0BDA">
-          <v:rect id="_x0000_i1266" style="width:0;height:1.5pt" o:hralign="center" o:hrstd="t" o:hr="t" fillcolor="#a0a0a0" stroked="f"/>
+          <v:rect id="_x0000_i1032" style="width:0;height:1.5pt" o:hralign="center" o:hrstd="t" o:hr="t" fillcolor="#a0a0a0" stroked="f"/>
         </w:pict>
       </w:r>
     </w:p>
@@ -7322,7 +7322,7 @@
       </w:pPr>
       <w:r>
         <w:pict w14:anchorId="2CC971FA">
-          <v:rect id="_x0000_i1267" style="width:0;height:1.5pt" o:hralign="center" o:hrstd="t" o:hr="t" fillcolor="#a0a0a0" stroked="f"/>
+          <v:rect id="_x0000_i1033" style="width:0;height:1.5pt" o:hralign="center" o:hrstd="t" o:hr="t" fillcolor="#a0a0a0" stroked="f"/>
         </w:pict>
       </w:r>
     </w:p>
@@ -7392,7 +7392,7 @@
       </w:pPr>
       <w:r>
         <w:pict w14:anchorId="47265E1C">
-          <v:rect id="_x0000_i1268" style="width:0;height:1.5pt" o:hralign="center" o:hrstd="t" o:hr="t" fillcolor="#a0a0a0" stroked="f"/>
+          <v:rect id="_x0000_i1034" style="width:0;height:1.5pt" o:hralign="center" o:hrstd="t" o:hr="t" fillcolor="#a0a0a0" stroked="f"/>
         </w:pict>
       </w:r>
     </w:p>
@@ -7519,7 +7519,7 @@
       </w:pPr>
       <w:r>
         <w:pict w14:anchorId="25F52D4B">
-          <v:rect id="_x0000_i1269" style="width:0;height:1.5pt" o:hralign="center" o:hrstd="t" o:hr="t" fillcolor="#a0a0a0" stroked="f"/>
+          <v:rect id="_x0000_i1035" style="width:0;height:1.5pt" o:hralign="center" o:hrstd="t" o:hr="t" fillcolor="#a0a0a0" stroked="f"/>
         </w:pict>
       </w:r>
     </w:p>
@@ -7610,7 +7610,7 @@
       </w:pPr>
       <w:r>
         <w:pict w14:anchorId="49D756E9">
-          <v:rect id="_x0000_i1270" style="width:0;height:1.5pt" o:hralign="center" o:hrstd="t" o:hr="t" fillcolor="#a0a0a0" stroked="f"/>
+          <v:rect id="_x0000_i1036" style="width:0;height:1.5pt" o:hralign="center" o:hrstd="t" o:hr="t" fillcolor="#a0a0a0" stroked="f"/>
         </w:pict>
       </w:r>
     </w:p>
@@ -7684,7 +7684,7 @@
       </w:pPr>
       <w:r>
         <w:pict w14:anchorId="652DF91E">
-          <v:rect id="_x0000_i1271" style="width:0;height:1.5pt" o:hralign="center" o:hrstd="t" o:hr="t" fillcolor="#a0a0a0" stroked="f"/>
+          <v:rect id="_x0000_i1037" style="width:0;height:1.5pt" o:hralign="center" o:hrstd="t" o:hr="t" fillcolor="#a0a0a0" stroked="f"/>
         </w:pict>
       </w:r>
     </w:p>
@@ -7742,7 +7742,7 @@
       </w:pPr>
       <w:r>
         <w:pict w14:anchorId="2FBAD0E3">
-          <v:rect id="_x0000_i1272" style="width:0;height:1.5pt" o:hralign="center" o:hrstd="t" o:hr="t" fillcolor="#a0a0a0" stroked="f"/>
+          <v:rect id="_x0000_i1038" style="width:0;height:1.5pt" o:hralign="center" o:hrstd="t" o:hr="t" fillcolor="#a0a0a0" stroked="f"/>
         </w:pict>
       </w:r>
     </w:p>
@@ -7840,7 +7840,7 @@
       </w:pPr>
       <w:r>
         <w:pict w14:anchorId="2CEC57E7">
-          <v:rect id="_x0000_i1273" style="width:0;height:1.5pt" o:hralign="center" o:hrstd="t" o:hr="t" fillcolor="#a0a0a0" stroked="f"/>
+          <v:rect id="_x0000_i1039" style="width:0;height:1.5pt" o:hralign="center" o:hrstd="t" o:hr="t" fillcolor="#a0a0a0" stroked="f"/>
         </w:pict>
       </w:r>
     </w:p>
@@ -7914,7 +7914,7 @@
       </w:pPr>
       <w:r>
         <w:pict w14:anchorId="01F4FEAE">
-          <v:rect id="_x0000_i1274" style="width:0;height:1.5pt" o:hralign="center" o:hrstd="t" o:hr="t" fillcolor="#a0a0a0" stroked="f"/>
+          <v:rect id="_x0000_i1040" style="width:0;height:1.5pt" o:hralign="center" o:hrstd="t" o:hr="t" fillcolor="#a0a0a0" stroked="f"/>
         </w:pict>
       </w:r>
     </w:p>
@@ -7992,7 +7992,7 @@
       </w:pPr>
       <w:r>
         <w:pict w14:anchorId="2EDB10CF">
-          <v:rect id="_x0000_i1275" style="width:0;height:1.5pt" o:hralign="center" o:hrstd="t" o:hr="t" fillcolor="#a0a0a0" stroked="f"/>
+          <v:rect id="_x0000_i1041" style="width:0;height:1.5pt" o:hralign="center" o:hrstd="t" o:hr="t" fillcolor="#a0a0a0" stroked="f"/>
         </w:pict>
       </w:r>
     </w:p>
@@ -8054,7 +8054,7 @@
       </w:pPr>
       <w:r>
         <w:pict w14:anchorId="2520A680">
-          <v:rect id="_x0000_i1276" style="width:0;height:1.5pt" o:hralign="center" o:hrstd="t" o:hr="t" fillcolor="#a0a0a0" stroked="f"/>
+          <v:rect id="_x0000_i1042" style="width:0;height:1.5pt" o:hralign="center" o:hrstd="t" o:hr="t" fillcolor="#a0a0a0" stroked="f"/>
         </w:pict>
       </w:r>
     </w:p>
@@ -8126,7 +8126,7 @@
       </w:pPr>
       <w:r>
         <w:pict w14:anchorId="70A04A0C">
-          <v:rect id="_x0000_i1277" style="width:0;height:1.5pt" o:hralign="center" o:hrstd="t" o:hr="t" fillcolor="#a0a0a0" stroked="f"/>
+          <v:rect id="_x0000_i1043" style="width:0;height:1.5pt" o:hralign="center" o:hrstd="t" o:hr="t" fillcolor="#a0a0a0" stroked="f"/>
         </w:pict>
       </w:r>
     </w:p>
@@ -8200,7 +8200,7 @@
       </w:pPr>
       <w:r>
         <w:pict w14:anchorId="5045AE7C">
-          <v:rect id="_x0000_i1278" style="width:0;height:1.5pt" o:hralign="center" o:hrstd="t" o:hr="t" fillcolor="#a0a0a0" stroked="f"/>
+          <v:rect id="_x0000_i1044" style="width:0;height:1.5pt" o:hralign="center" o:hrstd="t" o:hr="t" fillcolor="#a0a0a0" stroked="f"/>
         </w:pict>
       </w:r>
     </w:p>
@@ -8259,7 +8259,7 @@
       </w:pPr>
       <w:r>
         <w:pict w14:anchorId="1C43BC44">
-          <v:rect id="_x0000_i1279" style="width:0;height:1.5pt" o:hralign="center" o:hrstd="t" o:hr="t" fillcolor="#a0a0a0" stroked="f"/>
+          <v:rect id="_x0000_i1045" style="width:0;height:1.5pt" o:hralign="center" o:hrstd="t" o:hr="t" fillcolor="#a0a0a0" stroked="f"/>
         </w:pict>
       </w:r>
     </w:p>
@@ -8309,7 +8309,7 @@
       </w:pPr>
       <w:r>
         <w:pict w14:anchorId="6D9A41C9">
-          <v:rect id="_x0000_i1280" style="width:0;height:1.5pt" o:hralign="center" o:hrstd="t" o:hr="t" fillcolor="#a0a0a0" stroked="f"/>
+          <v:rect id="_x0000_i1046" style="width:0;height:1.5pt" o:hralign="center" o:hrstd="t" o:hr="t" fillcolor="#a0a0a0" stroked="f"/>
         </w:pict>
       </w:r>
     </w:p>
@@ -8431,7 +8431,7 @@
       </w:pPr>
       <w:r>
         <w:pict w14:anchorId="51DAA7FE">
-          <v:rect id="_x0000_i1281" style="width:0;height:1.5pt" o:hralign="center" o:hrstd="t" o:hr="t" fillcolor="#a0a0a0" stroked="f"/>
+          <v:rect id="_x0000_i1047" style="width:0;height:1.5pt" o:hralign="center" o:hrstd="t" o:hr="t" fillcolor="#a0a0a0" stroked="f"/>
         </w:pict>
       </w:r>
     </w:p>
@@ -8497,7 +8497,7 @@
       </w:pPr>
       <w:r>
         <w:pict w14:anchorId="4C6B8B5F">
-          <v:rect id="_x0000_i1282" style="width:0;height:1.5pt" o:hralign="center" o:hrstd="t" o:hr="t" fillcolor="#a0a0a0" stroked="f"/>
+          <v:rect id="_x0000_i1048" style="width:0;height:1.5pt" o:hralign="center" o:hrstd="t" o:hr="t" fillcolor="#a0a0a0" stroked="f"/>
         </w:pict>
       </w:r>
     </w:p>
@@ -8549,7 +8549,7 @@
       </w:pPr>
       <w:r>
         <w:pict w14:anchorId="54CE9C05">
-          <v:rect id="_x0000_i1283" style="width:0;height:1.5pt" o:hralign="center" o:hrstd="t" o:hr="t" fillcolor="#a0a0a0" stroked="f"/>
+          <v:rect id="_x0000_i1049" style="width:0;height:1.5pt" o:hralign="center" o:hrstd="t" o:hr="t" fillcolor="#a0a0a0" stroked="f"/>
         </w:pict>
       </w:r>
     </w:p>
@@ -8636,7 +8636,7 @@
       </w:pPr>
       <w:r>
         <w:pict w14:anchorId="154443DC">
-          <v:rect id="_x0000_i1284" style="width:0;height:1.5pt" o:hralign="center" o:hrstd="t" o:hr="t" fillcolor="#a0a0a0" stroked="f"/>
+          <v:rect id="_x0000_i1050" style="width:0;height:1.5pt" o:hralign="center" o:hrstd="t" o:hr="t" fillcolor="#a0a0a0" stroked="f"/>
         </w:pict>
       </w:r>
     </w:p>
@@ -8686,7 +8686,7 @@
       </w:pPr>
       <w:r>
         <w:pict w14:anchorId="76EC12CE">
-          <v:rect id="_x0000_i1285" style="width:0;height:1.5pt" o:hralign="center" o:hrstd="t" o:hr="t" fillcolor="#a0a0a0" stroked="f"/>
+          <v:rect id="_x0000_i1051" style="width:0;height:1.5pt" o:hralign="center" o:hrstd="t" o:hr="t" fillcolor="#a0a0a0" stroked="f"/>
         </w:pict>
       </w:r>
     </w:p>
@@ -8768,7 +8768,7 @@
       </w:pPr>
       <w:r>
         <w:pict w14:anchorId="599A5867">
-          <v:rect id="_x0000_i1286" style="width:0;height:1.5pt" o:hralign="center" o:hrstd="t" o:hr="t" fillcolor="#a0a0a0" stroked="f"/>
+          <v:rect id="_x0000_i1052" style="width:0;height:1.5pt" o:hralign="center" o:hrstd="t" o:hr="t" fillcolor="#a0a0a0" stroked="f"/>
         </w:pict>
       </w:r>
     </w:p>
@@ -8862,7 +8862,7 @@
       </w:pPr>
       <w:r>
         <w:pict w14:anchorId="113E5318">
-          <v:rect id="_x0000_i1287" style="width:0;height:1.5pt" o:hralign="center" o:hrstd="t" o:hr="t" fillcolor="#a0a0a0" stroked="f"/>
+          <v:rect id="_x0000_i1053" style="width:0;height:1.5pt" o:hralign="center" o:hrstd="t" o:hr="t" fillcolor="#a0a0a0" stroked="f"/>
         </w:pict>
       </w:r>
     </w:p>
@@ -8922,7 +8922,7 @@
       </w:pPr>
       <w:r>
         <w:pict w14:anchorId="1F0673DF">
-          <v:rect id="_x0000_i1288" style="width:0;height:1.5pt" o:hralign="center" o:hrstd="t" o:hr="t" fillcolor="#a0a0a0" stroked="f"/>
+          <v:rect id="_x0000_i1054" style="width:0;height:1.5pt" o:hralign="center" o:hrstd="t" o:hr="t" fillcolor="#a0a0a0" stroked="f"/>
         </w:pict>
       </w:r>
     </w:p>
@@ -9005,7 +9005,7 @@
       </w:pPr>
       <w:r>
         <w:pict w14:anchorId="5597F5AC">
-          <v:rect id="_x0000_i1289" style="width:0;height:1.5pt" o:hralign="center" o:hrstd="t" o:hr="t" fillcolor="#a0a0a0" stroked="f"/>
+          <v:rect id="_x0000_i1055" style="width:0;height:1.5pt" o:hralign="center" o:hrstd="t" o:hr="t" fillcolor="#a0a0a0" stroked="f"/>
         </w:pict>
       </w:r>
     </w:p>
@@ -9071,7 +9071,7 @@
       </w:pPr>
       <w:r>
         <w:pict w14:anchorId="41B8A226">
-          <v:rect id="_x0000_i1290" style="width:0;height:1.5pt" o:hralign="center" o:hrstd="t" o:hr="t" fillcolor="#a0a0a0" stroked="f"/>
+          <v:rect id="_x0000_i1056" style="width:0;height:1.5pt" o:hralign="center" o:hrstd="t" o:hr="t" fillcolor="#a0a0a0" stroked="f"/>
         </w:pict>
       </w:r>
     </w:p>
@@ -9121,7 +9121,7 @@
       </w:pPr>
       <w:r>
         <w:pict w14:anchorId="63315D66">
-          <v:rect id="_x0000_i1291" style="width:0;height:1.5pt" o:hralign="center" o:hrstd="t" o:hr="t" fillcolor="#a0a0a0" stroked="f"/>
+          <v:rect id="_x0000_i1057" style="width:0;height:1.5pt" o:hralign="center" o:hrstd="t" o:hr="t" fillcolor="#a0a0a0" stroked="f"/>
         </w:pict>
       </w:r>
     </w:p>
@@ -9187,7 +9187,7 @@
       </w:pPr>
       <w:r>
         <w:pict w14:anchorId="77D90AD6">
-          <v:rect id="_x0000_i1292" style="width:0;height:1.5pt" o:hralign="center" o:hrstd="t" o:hr="t" fillcolor="#a0a0a0" stroked="f"/>
+          <v:rect id="_x0000_i1058" style="width:0;height:1.5pt" o:hralign="center" o:hrstd="t" o:hr="t" fillcolor="#a0a0a0" stroked="f"/>
         </w:pict>
       </w:r>
     </w:p>
@@ -9257,7 +9257,7 @@
       </w:pPr>
       <w:r>
         <w:pict w14:anchorId="5C81AC73">
-          <v:rect id="_x0000_i1293" style="width:0;height:1.5pt" o:hralign="center" o:hrstd="t" o:hr="t" fillcolor="#a0a0a0" stroked="f"/>
+          <v:rect id="_x0000_i1059" style="width:0;height:1.5pt" o:hralign="center" o:hrstd="t" o:hr="t" fillcolor="#a0a0a0" stroked="f"/>
         </w:pict>
       </w:r>
     </w:p>
@@ -9423,7 +9423,7 @@
       </w:pPr>
       <w:r>
         <w:pict w14:anchorId="75C1A997">
-          <v:rect id="_x0000_i1294" style="width:0;height:1.5pt" o:hralign="center" o:hrstd="t" o:hr="t" fillcolor="#a0a0a0" stroked="f"/>
+          <v:rect id="_x0000_i1060" style="width:0;height:1.5pt" o:hralign="center" o:hrstd="t" o:hr="t" fillcolor="#a0a0a0" stroked="f"/>
         </w:pict>
       </w:r>
     </w:p>
@@ -9617,7 +9617,7 @@
       </w:pPr>
       <w:r>
         <w:pict w14:anchorId="219402B0">
-          <v:rect id="_x0000_i1295" style="width:0;height:1.5pt" o:hralign="center" o:hrstd="t" o:hr="t" fillcolor="#a0a0a0" stroked="f"/>
+          <v:rect id="_x0000_i1061" style="width:0;height:1.5pt" o:hralign="center" o:hrstd="t" o:hr="t" fillcolor="#a0a0a0" stroked="f"/>
         </w:pict>
       </w:r>
     </w:p>
@@ -9840,7 +9840,7 @@
       </w:pPr>
       <w:r>
         <w:pict w14:anchorId="4637E517">
-          <v:rect id="_x0000_i1296" style="width:0;height:1.5pt" o:hralign="center" o:hrstd="t" o:hr="t" fillcolor="#a0a0a0" stroked="f"/>
+          <v:rect id="_x0000_i1062" style="width:0;height:1.5pt" o:hralign="center" o:hrstd="t" o:hr="t" fillcolor="#a0a0a0" stroked="f"/>
         </w:pict>
       </w:r>
     </w:p>
@@ -10030,7 +10030,7 @@
       </w:pPr>
       <w:r>
         <w:pict w14:anchorId="695C844F">
-          <v:rect id="_x0000_i1297" style="width:0;height:1.5pt" o:hralign="center" o:hrstd="t" o:hr="t" fillcolor="#a0a0a0" stroked="f"/>
+          <v:rect id="_x0000_i1063" style="width:0;height:1.5pt" o:hralign="center" o:hrstd="t" o:hr="t" fillcolor="#a0a0a0" stroked="f"/>
         </w:pict>
       </w:r>
     </w:p>
@@ -10279,6 +10279,10 @@
     <w:p>
       <w:pPr>
         <w:spacing w:after="0"/>
+        <w:rPr>
+          <w:b/>
+          <w:bCs/>
+        </w:rPr>
       </w:pPr>
       <w:r>
         <w:rPr>
@@ -10291,6 +10295,261 @@
     <w:p>
       <w:pPr>
         <w:spacing w:after="0"/>
+        <w:rPr>
+          <w:b/>
+          <w:bCs/>
+        </w:rPr>
+      </w:pPr>
+    </w:p>
+    <w:p>
+      <w:pPr>
+        <w:spacing w:after="0"/>
+        <w:rPr>
+          <w:b/>
+          <w:bCs/>
+          <w:color w:val="0070C0"/>
+        </w:rPr>
+      </w:pPr>
+      <w:r>
+        <w:rPr>
+          <w:b/>
+          <w:bCs/>
+          <w:color w:val="0070C0"/>
+        </w:rPr>
+        <w:t>Projects related terms :</w:t>
+      </w:r>
+    </w:p>
+    <w:p>
+      <w:pPr>
+        <w:spacing w:after="0"/>
+        <w:rPr>
+          <w:b/>
+          <w:bCs/>
+        </w:rPr>
+      </w:pPr>
+      <w:r>
+        <w:t>JpaRepository expects:</w:t>
+      </w:r>
+      <w:r>
+        <w:t xml:space="preserve"> </w:t>
+      </w:r>
+      <w:r>
+        <w:rPr>
+          <w:b/>
+          <w:bCs/>
+        </w:rPr>
+        <w:t>JpaRepository&lt;EntityType, IdType&gt;</w:t>
+      </w:r>
+    </w:p>
+    <w:p>
+      <w:pPr>
+        <w:spacing w:after="0"/>
+      </w:pPr>
+    </w:p>
+    <w:p>
+      <w:pPr>
+        <w:spacing w:after="0"/>
+      </w:pPr>
+      <w:r>
+        <w:rPr>
+          <w:b/>
+          <w:bCs/>
+        </w:rPr>
+        <w:t>Lombok</w:t>
+      </w:r>
+      <w:r>
+        <w:t xml:space="preserve"> : Inbuilt Library which has following</w:t>
+      </w:r>
+    </w:p>
+    <w:p>
+      <w:pPr>
+        <w:spacing w:after="0"/>
+      </w:pPr>
+      <w:r>
+        <w:t xml:space="preserve">@Getter </w:t>
+      </w:r>
+    </w:p>
+    <w:p>
+      <w:pPr>
+        <w:spacing w:after="0"/>
+      </w:pPr>
+      <w:r>
+        <w:t>@Setter</w:t>
+      </w:r>
+    </w:p>
+    <w:p>
+      <w:pPr>
+        <w:spacing w:after="0"/>
+      </w:pPr>
+      <w:r>
+        <w:t xml:space="preserve"> @NoArgsConstructor</w:t>
+      </w:r>
+    </w:p>
+    <w:p>
+      <w:pPr>
+        <w:spacing w:after="0"/>
+      </w:pPr>
+      <w:r>
+        <w:t xml:space="preserve"> @AllArgsConstructor</w:t>
+      </w:r>
+    </w:p>
+    <w:p>
+      <w:pPr>
+        <w:spacing w:after="0"/>
+      </w:pPr>
+    </w:p>
+    <w:p>
+      <w:pPr>
+        <w:spacing w:after="0"/>
+      </w:pPr>
+      <w:r>
+        <w:rPr>
+          <w:b/>
+          <w:bCs/>
+        </w:rPr>
+        <w:t>@</w:t>
+      </w:r>
+      <w:r>
+        <w:rPr>
+          <w:b/>
+          <w:bCs/>
+        </w:rPr>
+        <w:t>PathVariable</w:t>
+      </w:r>
+      <w:r>
+        <w:rPr>
+          <w:b/>
+          <w:bCs/>
+        </w:rPr>
+        <w:t xml:space="preserve"> : </w:t>
+      </w:r>
+      <w:r>
+        <w:t xml:space="preserve">used to get </w:t>
+      </w:r>
+      <w:r>
+        <w:t xml:space="preserve">path variable </w:t>
+      </w:r>
+      <w:r>
+        <w:t>from url eg: users/32</w:t>
+      </w:r>
+    </w:p>
+    <w:p>
+      <w:pPr>
+        <w:spacing w:after="0"/>
+      </w:pPr>
+      <w:r>
+        <w:rPr>
+          <w:b/>
+          <w:bCs/>
+        </w:rPr>
+        <w:t>@RequestParam</w:t>
+      </w:r>
+      <w:r>
+        <w:rPr>
+          <w:b/>
+          <w:bCs/>
+        </w:rPr>
+        <w:t xml:space="preserve"> : </w:t>
+      </w:r>
+      <w:r>
+        <w:t>used to get param from url eg: users</w:t>
+      </w:r>
+      <w:r>
+        <w:rPr>
+          <w:b/>
+          <w:bCs/>
+        </w:rPr>
+        <w:t>?name=vikas</w:t>
+      </w:r>
+    </w:p>
+    <w:p>
+      <w:pPr>
+        <w:spacing w:after="0"/>
+      </w:pPr>
+      <w:r>
+        <w:rPr>
+          <w:b/>
+          <w:bCs/>
+        </w:rPr>
+        <w:t>@Request</w:t>
+      </w:r>
+      <w:r>
+        <w:rPr>
+          <w:b/>
+          <w:bCs/>
+        </w:rPr>
+        <w:t>Body</w:t>
+      </w:r>
+      <w:r>
+        <w:rPr>
+          <w:b/>
+          <w:bCs/>
+        </w:rPr>
+        <w:t xml:space="preserve"> : </w:t>
+      </w:r>
+      <w:r>
+        <w:t xml:space="preserve">used to get </w:t>
+      </w:r>
+      <w:r>
+        <w:t>json body</w:t>
+      </w:r>
+      <w:r>
+        <w:t xml:space="preserve"> from url </w:t>
+      </w:r>
+    </w:p>
+    <w:p>
+      <w:pPr>
+        <w:spacing w:after="0"/>
+      </w:pPr>
+    </w:p>
+    <w:p>
+      <w:pPr>
+        <w:spacing w:after="0"/>
+      </w:pPr>
+      <w:r>
+        <w:rPr>
+          <w:b/>
+          <w:bCs/>
+        </w:rPr>
+        <w:t xml:space="preserve">ResponseEntity&lt;User&gt; </w:t>
+      </w:r>
+      <w:r>
+        <w:rPr>
+          <w:b/>
+          <w:bCs/>
+        </w:rPr>
+        <w:t xml:space="preserve"> </w:t>
+      </w:r>
+      <w:r>
+        <w:t>// to write custom headers</w:t>
+      </w:r>
+    </w:p>
+    <w:p>
+      <w:pPr>
+        <w:spacing w:after="0"/>
+      </w:pPr>
+      <w:r>
+        <w:t xml:space="preserve">return </w:t>
+      </w:r>
+      <w:r>
+        <w:t>ResponseEntity</w:t>
+      </w:r>
+      <w:r>
+        <w:t>.status(200 or Http.status.term).body(…)</w:t>
+      </w:r>
+    </w:p>
+    <w:p>
+      <w:pPr>
+        <w:spacing w:after="0"/>
+      </w:pPr>
+    </w:p>
+    <w:p>
+      <w:pPr>
+        <w:spacing w:after="0"/>
+        <w:rPr>
+          <w:b/>
+          <w:bCs/>
+        </w:rPr>
       </w:pPr>
     </w:p>
     <w:sectPr>

</xml_diff>